<commit_message>
Add FVH GLP-1 Bridge program content to the IPO-framework MOU
New Section 5: FVH's US GLP-1 patient-management program from the
company proforma (fvh-glp1-proforma.xlsx) - CPT care pathway
(99204/99213/G0506/99453 + $168.92/mo RPM/PCM recurring), 2,500 ->
10,000 patients, $2.2M (2026) -> $16.7M (2027), Dec-27 MRR $1.59M/mo.
Consolidated forecast now includes the FVH line: $17M (2026) -> $75M
revenue / $22M EBITDA (2030). Party description, synergy, valuation,
conditions and timeline updated accordingly; proforma committed as
source.
</commit_message>
<xml_diff>
--- a/synexo/GenApep_IPO_MOU.docx
+++ b/synexo/GenApep_IPO_MOU.docx
@@ -120,7 +120,7 @@
               <w:rPr>
                 <w:sz w:val="19"/>
               </w:rPr>
-              <w:t>A U.S. company that made its SEC filing in December 2024. Proposed listed holding vehicle. Referenced existing shareholder: Mr. Ernie Lee.</w:t>
+              <w:t>U.S. digital-health and clinical-services company — remote patient monitoring (RPM) and chronic-care management — and operator of the GLP-1 Bridge patient-management program (Section 5). Made its SEC filing in December 2024 (filing history to be confirmed against FVH's EDGAR records). Proposed listed holding vehicle. Referenced existing shareholder: Mr. Ernie Lee.</w:t>
             </w:r>
           </w:p>
         </w:tc>
@@ -685,10 +685,25 @@
         <w:rPr>
           <w:b/>
         </w:rPr>
-        <w:t xml:space="preserve">GLP-1 bridge in GI — </w:t>
+        <w:t xml:space="preserve">FVH contribution — GLP-1 Bridge in GI (US) — </w:t>
       </w:r>
       <w:r>
-        <w:t>Peptide programs supporting patients on and transitioning off GLP-1 therapies — gastrointestinal support, muscle-preservation and metabolic-bridge formulations designed by CodeLife.AI and manufactured by Eyesel under GMP.</w:t>
+        <w:t>The operating GLP-1 patient-management program detailed in Section 5 — a CPT-reimbursed, recurring-revenue care platform (assessment → care plan → monthly RPM/PCM monitoring) targeting 10,000 enrolled patients by end-2027 — plus the listed vehicle, SEC reporting history and a U.S. clinical channel for the group's products.</w:t>
+      </w:r>
+    </w:p>
+    <w:p>
+      <w:pPr>
+        <w:pStyle w:val="ListBullet"/>
+        <w:spacing w:after="60"/>
+      </w:pPr>
+      <w:r>
+        <w:rPr>
+          <w:b/>
+        </w:rPr>
+        <w:t xml:space="preserve">GLP-1 × GenApep synergy — </w:t>
+      </w:r>
+      <w:r>
+        <w:t>FVH's GLP-1 patient base is the natural U.S. channel for GenApep peptide programs: GI and metabolic support on- and off-therapy, muscle-preservation formulations, and GLP-1-associated hair-loss management — designed by CodeLife.AI, manufactured by Eyesel under GMP.</w:t>
       </w:r>
     </w:p>
     <w:p>
@@ -756,7 +771,672 @@
         <w:pStyle w:val="Heading2"/>
       </w:pPr>
       <w:r>
-        <w:t>5. Consolidated revenue forecast (illustrative, US$M)</w:t>
+        <w:t>5. FVH — the GLP-1 Bridge program (US)</w:t>
+      </w:r>
+    </w:p>
+    <w:p>
+      <w:pPr>
+        <w:spacing w:after="120"/>
+      </w:pPr>
+      <w:r>
+        <w:rPr>
+          <w:b w:val="0"/>
+          <w:i w:val="0"/>
+          <w:sz w:val="21"/>
+        </w:rPr>
+        <w:t>FVH's operating content: a GLP-1 patient-management program (gastro-intestinal &amp; metabolic care around GLP-1 therapy) billed under U.S. CPT/HCPCS codes at Nurse-Practitioner rates (proforma basis: LA County). Source: FVH GLP-1 proforma, July 2026 → December 2027 (fvh-glp1-proforma.xlsx).</w:t>
+      </w:r>
+    </w:p>
+    <w:p>
+      <w:pPr>
+        <w:pStyle w:val="Heading3"/>
+      </w:pPr>
+      <w:r>
+        <w:t>5.1 Care pathway &amp; reimbursement</w:t>
+      </w:r>
+    </w:p>
+    <w:tbl>
+      <w:tblPr>
+        <w:tblStyle w:val="LightGrid-Accent1"/>
+        <w:tblW w:type="auto" w:w="0"/>
+        <w:jc w:val="center"/>
+        <w:tblLook w:firstColumn="1" w:firstRow="1" w:lastColumn="0" w:lastRow="0" w:noHBand="0" w:noVBand="1" w:val="04A0"/>
+      </w:tblPr>
+      <w:tblGrid>
+        <w:gridCol w:w="2160"/>
+        <w:gridCol w:w="2160"/>
+        <w:gridCol w:w="2160"/>
+        <w:gridCol w:w="2160"/>
+      </w:tblGrid>
+      <w:tr>
+        <w:tc>
+          <w:tcPr>
+            <w:tcW w:type="dxa" w:w="2160"/>
+          </w:tcPr>
+          <w:p>
+            <w:r>
+              <w:rPr>
+                <w:b/>
+                <w:sz w:val="19"/>
+              </w:rPr>
+              <w:t>Code</w:t>
+            </w:r>
+          </w:p>
+        </w:tc>
+        <w:tc>
+          <w:tcPr>
+            <w:tcW w:type="dxa" w:w="1728"/>
+          </w:tcPr>
+          <w:p>
+            <w:r>
+              <w:rPr>
+                <w:b/>
+                <w:sz w:val="19"/>
+              </w:rPr>
+              <w:t>When</w:t>
+            </w:r>
+          </w:p>
+        </w:tc>
+        <w:tc>
+          <w:tcPr>
+            <w:tcW w:type="dxa" w:w="1584"/>
+          </w:tcPr>
+          <w:p>
+            <w:r>
+              <w:rPr>
+                <w:b/>
+                <w:sz w:val="19"/>
+              </w:rPr>
+              <w:t>Rate</w:t>
+            </w:r>
+          </w:p>
+        </w:tc>
+        <w:tc>
+          <w:tcPr>
+            <w:tcW w:type="dxa" w:w="3888"/>
+          </w:tcPr>
+          <w:p>
+            <w:r>
+              <w:rPr>
+                <w:b/>
+                <w:sz w:val="19"/>
+              </w:rPr>
+              <w:t>Service</w:t>
+            </w:r>
+          </w:p>
+        </w:tc>
+      </w:tr>
+      <w:tr>
+        <w:tc>
+          <w:tcPr>
+            <w:tcW w:type="dxa" w:w="2160"/>
+          </w:tcPr>
+          <w:p>
+            <w:r>
+              <w:rPr>
+                <w:b/>
+                <w:sz w:val="19"/>
+              </w:rPr>
+              <w:t>99204</w:t>
+            </w:r>
+          </w:p>
+        </w:tc>
+        <w:tc>
+          <w:tcPr>
+            <w:tcW w:type="dxa" w:w="1728"/>
+          </w:tcPr>
+          <w:p>
+            <w:r>
+              <w:rPr>
+                <w:sz w:val="19"/>
+              </w:rPr>
+              <w:t>Day 1</w:t>
+            </w:r>
+          </w:p>
+        </w:tc>
+        <w:tc>
+          <w:tcPr>
+            <w:tcW w:type="dxa" w:w="1584"/>
+          </w:tcPr>
+          <w:p>
+            <w:r>
+              <w:rPr>
+                <w:sz w:val="19"/>
+              </w:rPr>
+              <w:t>$150.76</w:t>
+            </w:r>
+          </w:p>
+        </w:tc>
+        <w:tc>
+          <w:tcPr>
+            <w:tcW w:type="dxa" w:w="3888"/>
+          </w:tcPr>
+          <w:p>
+            <w:r>
+              <w:rPr>
+                <w:sz w:val="19"/>
+              </w:rPr>
+              <w:t>Comprehensive GI &amp; metabolic assessment</w:t>
+            </w:r>
+          </w:p>
+        </w:tc>
+      </w:tr>
+      <w:tr>
+        <w:tc>
+          <w:tcPr>
+            <w:tcW w:type="dxa" w:w="2160"/>
+          </w:tcPr>
+          <w:p>
+            <w:r>
+              <w:rPr>
+                <w:b/>
+                <w:sz w:val="19"/>
+              </w:rPr>
+              <w:t>99213</w:t>
+            </w:r>
+          </w:p>
+        </w:tc>
+        <w:tc>
+          <w:tcPr>
+            <w:tcW w:type="dxa" w:w="1728"/>
+          </w:tcPr>
+          <w:p>
+            <w:r>
+              <w:rPr>
+                <w:sz w:val="19"/>
+              </w:rPr>
+              <w:t>Week 2</w:t>
+            </w:r>
+          </w:p>
+        </w:tc>
+        <w:tc>
+          <w:tcPr>
+            <w:tcW w:type="dxa" w:w="1584"/>
+          </w:tcPr>
+          <w:p>
+            <w:r>
+              <w:rPr>
+                <w:sz w:val="19"/>
+              </w:rPr>
+              <w:t>$89.16</w:t>
+            </w:r>
+          </w:p>
+        </w:tc>
+        <w:tc>
+          <w:tcPr>
+            <w:tcW w:type="dxa" w:w="3888"/>
+          </w:tcPr>
+          <w:p>
+            <w:r>
+              <w:rPr>
+                <w:sz w:val="19"/>
+              </w:rPr>
+              <w:t>Labs review, assessment, treatment initiation</w:t>
+            </w:r>
+          </w:p>
+        </w:tc>
+      </w:tr>
+      <w:tr>
+        <w:tc>
+          <w:tcPr>
+            <w:tcW w:type="dxa" w:w="2160"/>
+          </w:tcPr>
+          <w:p>
+            <w:r>
+              <w:rPr>
+                <w:b/>
+                <w:sz w:val="19"/>
+              </w:rPr>
+              <w:t>G0506</w:t>
+            </w:r>
+          </w:p>
+        </w:tc>
+        <w:tc>
+          <w:tcPr>
+            <w:tcW w:type="dxa" w:w="1728"/>
+          </w:tcPr>
+          <w:p>
+            <w:r>
+              <w:rPr>
+                <w:sz w:val="19"/>
+              </w:rPr>
+              <w:t>Month 1</w:t>
+            </w:r>
+          </w:p>
+        </w:tc>
+        <w:tc>
+          <w:tcPr>
+            <w:tcW w:type="dxa" w:w="1584"/>
+          </w:tcPr>
+          <w:p>
+            <w:r>
+              <w:rPr>
+                <w:sz w:val="19"/>
+              </w:rPr>
+              <w:t>$62.44</w:t>
+            </w:r>
+          </w:p>
+        </w:tc>
+        <w:tc>
+          <w:tcPr>
+            <w:tcW w:type="dxa" w:w="3888"/>
+          </w:tcPr>
+          <w:p>
+            <w:r>
+              <w:rPr>
+                <w:sz w:val="19"/>
+              </w:rPr>
+              <w:t>Care-plan establishment</w:t>
+            </w:r>
+          </w:p>
+        </w:tc>
+      </w:tr>
+      <w:tr>
+        <w:tc>
+          <w:tcPr>
+            <w:tcW w:type="dxa" w:w="2160"/>
+          </w:tcPr>
+          <w:p>
+            <w:r>
+              <w:rPr>
+                <w:b/>
+                <w:sz w:val="19"/>
+              </w:rPr>
+              <w:t>99453</w:t>
+            </w:r>
+          </w:p>
+        </w:tc>
+        <w:tc>
+          <w:tcPr>
+            <w:tcW w:type="dxa" w:w="1728"/>
+          </w:tcPr>
+          <w:p>
+            <w:r>
+              <w:rPr>
+                <w:sz w:val="19"/>
+              </w:rPr>
+              <w:t>Month 1</w:t>
+            </w:r>
+          </w:p>
+        </w:tc>
+        <w:tc>
+          <w:tcPr>
+            <w:tcW w:type="dxa" w:w="1584"/>
+          </w:tcPr>
+          <w:p>
+            <w:r>
+              <w:rPr>
+                <w:sz w:val="19"/>
+              </w:rPr>
+              <w:t>$22.00</w:t>
+            </w:r>
+          </w:p>
+        </w:tc>
+        <w:tc>
+          <w:tcPr>
+            <w:tcW w:type="dxa" w:w="3888"/>
+          </w:tcPr>
+          <w:p>
+            <w:r>
+              <w:rPr>
+                <w:sz w:val="19"/>
+              </w:rPr>
+              <w:t>RPM device (scale) set-up</w:t>
+            </w:r>
+          </w:p>
+        </w:tc>
+      </w:tr>
+      <w:tr>
+        <w:tc>
+          <w:tcPr>
+            <w:tcW w:type="dxa" w:w="2160"/>
+          </w:tcPr>
+          <w:p>
+            <w:r>
+              <w:rPr>
+                <w:b/>
+                <w:sz w:val="19"/>
+              </w:rPr>
+              <w:t>99426 + 99454 + 99457</w:t>
+            </w:r>
+          </w:p>
+        </w:tc>
+        <w:tc>
+          <w:tcPr>
+            <w:tcW w:type="dxa" w:w="1728"/>
+          </w:tcPr>
+          <w:p>
+            <w:r>
+              <w:rPr>
+                <w:sz w:val="19"/>
+              </w:rPr>
+              <w:t>Monthly (recurring)</w:t>
+            </w:r>
+          </w:p>
+        </w:tc>
+        <w:tc>
+          <w:tcPr>
+            <w:tcW w:type="dxa" w:w="1584"/>
+          </w:tcPr>
+          <w:p>
+            <w:r>
+              <w:rPr>
+                <w:sz w:val="19"/>
+              </w:rPr>
+              <w:t>$168.92 / month</w:t>
+            </w:r>
+          </w:p>
+        </w:tc>
+        <w:tc>
+          <w:tcPr>
+            <w:tcW w:type="dxa" w:w="3888"/>
+          </w:tcPr>
+          <w:p>
+            <w:r>
+              <w:rPr>
+                <w:sz w:val="19"/>
+              </w:rPr>
+              <w:t>PCM $67.80 + RPM data $52.11 + RPM weight management $49.01 — the MRR engine</w:t>
+            </w:r>
+          </w:p>
+        </w:tc>
+      </w:tr>
+      <w:tr>
+        <w:tc>
+          <w:tcPr>
+            <w:tcW w:type="dxa" w:w="2160"/>
+          </w:tcPr>
+          <w:p>
+            <w:r>
+              <w:rPr>
+                <w:b/>
+                <w:sz w:val="19"/>
+              </w:rPr>
+              <w:t>99213</w:t>
+            </w:r>
+          </w:p>
+        </w:tc>
+        <w:tc>
+          <w:tcPr>
+            <w:tcW w:type="dxa" w:w="1728"/>
+          </w:tcPr>
+          <w:p>
+            <w:r>
+              <w:rPr>
+                <w:sz w:val="19"/>
+              </w:rPr>
+              <w:t>Quarterly</w:t>
+            </w:r>
+          </w:p>
+        </w:tc>
+        <w:tc>
+          <w:tcPr>
+            <w:tcW w:type="dxa" w:w="1584"/>
+          </w:tcPr>
+          <w:p>
+            <w:r>
+              <w:rPr>
+                <w:sz w:val="19"/>
+              </w:rPr>
+              <w:t>$89.16</w:t>
+            </w:r>
+          </w:p>
+        </w:tc>
+        <w:tc>
+          <w:tcPr>
+            <w:tcW w:type="dxa" w:w="3888"/>
+          </w:tcPr>
+          <w:p>
+            <w:r>
+              <w:rPr>
+                <w:sz w:val="19"/>
+              </w:rPr>
+              <w:t>Recurring quarterly E/M follow-up</w:t>
+            </w:r>
+          </w:p>
+        </w:tc>
+      </w:tr>
+    </w:tbl>
+    <w:p>
+      <w:pPr>
+        <w:spacing w:after="40"/>
+      </w:pPr>
+    </w:p>
+    <w:p>
+      <w:pPr>
+        <w:pStyle w:val="Heading3"/>
+      </w:pPr>
+      <w:r>
+        <w:t>5.2 Program metrics (per proforma)</w:t>
+      </w:r>
+    </w:p>
+    <w:tbl>
+      <w:tblPr>
+        <w:tblStyle w:val="LightGrid-Accent1"/>
+        <w:tblW w:type="auto" w:w="0"/>
+        <w:jc w:val="center"/>
+        <w:tblLook w:firstColumn="1" w:firstRow="1" w:lastColumn="0" w:lastRow="0" w:noHBand="0" w:noVBand="1" w:val="04A0"/>
+      </w:tblPr>
+      <w:tblGrid>
+        <w:gridCol w:w="4320"/>
+        <w:gridCol w:w="4320"/>
+      </w:tblGrid>
+      <w:tr>
+        <w:tc>
+          <w:tcPr>
+            <w:tcW w:type="dxa" w:w="2304"/>
+          </w:tcPr>
+          <w:p>
+            <w:r>
+              <w:rPr>
+                <w:b/>
+                <w:sz w:val="19"/>
+              </w:rPr>
+              <w:t>Metric</w:t>
+            </w:r>
+          </w:p>
+        </w:tc>
+        <w:tc>
+          <w:tcPr>
+            <w:tcW w:type="dxa" w:w="7056"/>
+          </w:tcPr>
+          <w:p>
+            <w:r>
+              <w:rPr>
+                <w:b/>
+                <w:sz w:val="19"/>
+              </w:rPr>
+              <w:t>Value</w:t>
+            </w:r>
+          </w:p>
+        </w:tc>
+      </w:tr>
+      <w:tr>
+        <w:tc>
+          <w:tcPr>
+            <w:tcW w:type="dxa" w:w="2304"/>
+          </w:tcPr>
+          <w:p>
+            <w:r>
+              <w:rPr>
+                <w:b/>
+                <w:sz w:val="19"/>
+              </w:rPr>
+              <w:t>Model period</w:t>
+            </w:r>
+          </w:p>
+        </w:tc>
+        <w:tc>
+          <w:tcPr>
+            <w:tcW w:type="dxa" w:w="7056"/>
+          </w:tcPr>
+          <w:p>
+            <w:r>
+              <w:rPr>
+                <w:sz w:val="19"/>
+              </w:rPr>
+              <w:t>July 1, 2026 → December 31, 2027 (18 months); accelerating enrollment ramp</w:t>
+            </w:r>
+          </w:p>
+        </w:tc>
+      </w:tr>
+      <w:tr>
+        <w:tc>
+          <w:tcPr>
+            <w:tcW w:type="dxa" w:w="2304"/>
+          </w:tcPr>
+          <w:p>
+            <w:r>
+              <w:rPr>
+                <w:b/>
+                <w:sz w:val="19"/>
+              </w:rPr>
+              <w:t>Enrollment</w:t>
+            </w:r>
+          </w:p>
+        </w:tc>
+        <w:tc>
+          <w:tcPr>
+            <w:tcW w:type="dxa" w:w="7056"/>
+          </w:tcPr>
+          <w:p>
+            <w:r>
+              <w:rPr>
+                <w:sz w:val="19"/>
+              </w:rPr>
+              <w:t>2,500 patients by Dec-2026; 10,000 cumulative by Dec-2027; ~10% annual attrition</w:t>
+            </w:r>
+          </w:p>
+        </w:tc>
+      </w:tr>
+      <w:tr>
+        <w:tc>
+          <w:tcPr>
+            <w:tcW w:type="dxa" w:w="2304"/>
+          </w:tcPr>
+          <w:p>
+            <w:r>
+              <w:rPr>
+                <w:b/>
+                <w:sz w:val="19"/>
+              </w:rPr>
+              <w:t>Active patients</w:t>
+            </w:r>
+          </w:p>
+        </w:tc>
+        <w:tc>
+          <w:tcPr>
+            <w:tcW w:type="dxa" w:w="7056"/>
+          </w:tcPr>
+          <w:p>
+            <w:r>
+              <w:rPr>
+                <w:sz w:val="19"/>
+              </w:rPr>
+              <w:t>2,463 avg (2026) → 9,414 peak (Dec-2027)</w:t>
+            </w:r>
+          </w:p>
+        </w:tc>
+      </w:tr>
+      <w:tr>
+        <w:tc>
+          <w:tcPr>
+            <w:tcW w:type="dxa" w:w="2304"/>
+          </w:tcPr>
+          <w:p>
+            <w:r>
+              <w:rPr>
+                <w:b/>
+                <w:sz w:val="19"/>
+              </w:rPr>
+              <w:t>Revenue</w:t>
+            </w:r>
+          </w:p>
+        </w:tc>
+        <w:tc>
+          <w:tcPr>
+            <w:tcW w:type="dxa" w:w="7056"/>
+          </w:tcPr>
+          <w:p>
+            <w:r>
+              <w:rPr>
+                <w:sz w:val="19"/>
+              </w:rPr>
+              <w:t>US$2.2M (H2-2026) → US$16.7M (2027) — gross reimbursement, per proforma</w:t>
+            </w:r>
+          </w:p>
+        </w:tc>
+      </w:tr>
+      <w:tr>
+        <w:tc>
+          <w:tcPr>
+            <w:tcW w:type="dxa" w:w="2304"/>
+          </w:tcPr>
+          <w:p>
+            <w:r>
+              <w:rPr>
+                <w:b/>
+                <w:sz w:val="19"/>
+              </w:rPr>
+              <w:t>Recurring revenue</w:t>
+            </w:r>
+          </w:p>
+        </w:tc>
+        <w:tc>
+          <w:tcPr>
+            <w:tcW w:type="dxa" w:w="7056"/>
+          </w:tcPr>
+          <w:p>
+            <w:r>
+              <w:rPr>
+                <w:sz w:val="19"/>
+              </w:rPr>
+              <w:t>MRR US$1.59M/month exiting Dec-2027 (≈ US$19M annualised); ARPU $168.92/patient/month</w:t>
+            </w:r>
+          </w:p>
+        </w:tc>
+      </w:tr>
+      <w:tr>
+        <w:tc>
+          <w:tcPr>
+            <w:tcW w:type="dxa" w:w="2304"/>
+          </w:tcPr>
+          <w:p>
+            <w:r>
+              <w:rPr>
+                <w:b/>
+                <w:sz w:val="19"/>
+              </w:rPr>
+              <w:t>Unit value</w:t>
+            </w:r>
+          </w:p>
+        </w:tc>
+        <w:tc>
+          <w:tcPr>
+            <w:tcW w:type="dxa" w:w="7056"/>
+          </w:tcPr>
+          <w:p>
+            <w:r>
+              <w:rPr>
+                <w:sz w:val="19"/>
+              </w:rPr>
+              <w:t>≈ US$3,788 average revenue per enrolled patient (proforma LTV basis)</w:t>
+            </w:r>
+          </w:p>
+        </w:tc>
+      </w:tr>
+    </w:tbl>
+    <w:p>
+      <w:pPr>
+        <w:spacing w:after="40"/>
+      </w:pPr>
+    </w:p>
+    <w:p>
+      <w:pPr>
+        <w:pStyle w:val="Heading2"/>
+      </w:pPr>
+      <w:r>
+        <w:t>6. Consolidated revenue forecast (illustrative, US$M)</w:t>
       </w:r>
     </w:p>
     <w:tbl>
@@ -777,7 +1457,7 @@
       <w:tr>
         <w:tc>
           <w:tcPr>
-            <w:tcW w:type="dxa" w:w="3312"/>
+            <w:tcW w:type="dxa" w:w="3600"/>
           </w:tcPr>
           <w:p>
             <w:r>
@@ -791,7 +1471,7 @@
         </w:tc>
         <w:tc>
           <w:tcPr>
-            <w:tcW w:type="dxa" w:w="1224"/>
+            <w:tcW w:type="dxa" w:w="1152"/>
           </w:tcPr>
           <w:p>
             <w:r>
@@ -805,7 +1485,7 @@
         </w:tc>
         <w:tc>
           <w:tcPr>
-            <w:tcW w:type="dxa" w:w="1224"/>
+            <w:tcW w:type="dxa" w:w="1152"/>
           </w:tcPr>
           <w:p>
             <w:r>
@@ -819,7 +1499,7 @@
         </w:tc>
         <w:tc>
           <w:tcPr>
-            <w:tcW w:type="dxa" w:w="1224"/>
+            <w:tcW w:type="dxa" w:w="1152"/>
           </w:tcPr>
           <w:p>
             <w:r>
@@ -833,7 +1513,7 @@
         </w:tc>
         <w:tc>
           <w:tcPr>
-            <w:tcW w:type="dxa" w:w="1224"/>
+            <w:tcW w:type="dxa" w:w="1152"/>
           </w:tcPr>
           <w:p>
             <w:r>
@@ -847,7 +1527,7 @@
         </w:tc>
         <w:tc>
           <w:tcPr>
-            <w:tcW w:type="dxa" w:w="1224"/>
+            <w:tcW w:type="dxa" w:w="1152"/>
           </w:tcPr>
           <w:p>
             <w:r>
@@ -863,7 +1543,7 @@
       <w:tr>
         <w:tc>
           <w:tcPr>
-            <w:tcW w:type="dxa" w:w="3312"/>
+            <w:tcW w:type="dxa" w:w="3600"/>
           </w:tcPr>
           <w:p>
             <w:r>
@@ -877,7 +1557,7 @@
         </w:tc>
         <w:tc>
           <w:tcPr>
-            <w:tcW w:type="dxa" w:w="1224"/>
+            <w:tcW w:type="dxa" w:w="1152"/>
           </w:tcPr>
           <w:p>
             <w:r>
@@ -890,7 +1570,7 @@
         </w:tc>
         <w:tc>
           <w:tcPr>
-            <w:tcW w:type="dxa" w:w="1224"/>
+            <w:tcW w:type="dxa" w:w="1152"/>
           </w:tcPr>
           <w:p>
             <w:r>
@@ -903,7 +1583,7 @@
         </w:tc>
         <w:tc>
           <w:tcPr>
-            <w:tcW w:type="dxa" w:w="1224"/>
+            <w:tcW w:type="dxa" w:w="1152"/>
           </w:tcPr>
           <w:p>
             <w:r>
@@ -916,7 +1596,7 @@
         </w:tc>
         <w:tc>
           <w:tcPr>
-            <w:tcW w:type="dxa" w:w="1224"/>
+            <w:tcW w:type="dxa" w:w="1152"/>
           </w:tcPr>
           <w:p>
             <w:r>
@@ -929,7 +1609,7 @@
         </w:tc>
         <w:tc>
           <w:tcPr>
-            <w:tcW w:type="dxa" w:w="1224"/>
+            <w:tcW w:type="dxa" w:w="1152"/>
           </w:tcPr>
           <w:p>
             <w:r>
@@ -944,7 +1624,88 @@
       <w:tr>
         <w:tc>
           <w:tcPr>
-            <w:tcW w:type="dxa" w:w="3312"/>
+            <w:tcW w:type="dxa" w:w="3600"/>
+          </w:tcPr>
+          <w:p>
+            <w:r>
+              <w:rPr>
+                <w:b/>
+                <w:sz w:val="19"/>
+              </w:rPr>
+              <w:t>FVH GLP-1 Bridge (proforma → extrap.)</w:t>
+            </w:r>
+          </w:p>
+        </w:tc>
+        <w:tc>
+          <w:tcPr>
+            <w:tcW w:type="dxa" w:w="1152"/>
+          </w:tcPr>
+          <w:p>
+            <w:r>
+              <w:rPr>
+                <w:sz w:val="19"/>
+              </w:rPr>
+              <w:t>2.2</w:t>
+            </w:r>
+          </w:p>
+        </w:tc>
+        <w:tc>
+          <w:tcPr>
+            <w:tcW w:type="dxa" w:w="1152"/>
+          </w:tcPr>
+          <w:p>
+            <w:r>
+              <w:rPr>
+                <w:sz w:val="19"/>
+              </w:rPr>
+              <w:t>16.7</w:t>
+            </w:r>
+          </w:p>
+        </w:tc>
+        <w:tc>
+          <w:tcPr>
+            <w:tcW w:type="dxa" w:w="1152"/>
+          </w:tcPr>
+          <w:p>
+            <w:r>
+              <w:rPr>
+                <w:sz w:val="19"/>
+              </w:rPr>
+              <w:t>25.0</w:t>
+            </w:r>
+          </w:p>
+        </w:tc>
+        <w:tc>
+          <w:tcPr>
+            <w:tcW w:type="dxa" w:w="1152"/>
+          </w:tcPr>
+          <w:p>
+            <w:r>
+              <w:rPr>
+                <w:sz w:val="19"/>
+              </w:rPr>
+              <w:t>30.0</w:t>
+            </w:r>
+          </w:p>
+        </w:tc>
+        <w:tc>
+          <w:tcPr>
+            <w:tcW w:type="dxa" w:w="1152"/>
+          </w:tcPr>
+          <w:p>
+            <w:r>
+              <w:rPr>
+                <w:sz w:val="19"/>
+              </w:rPr>
+              <w:t>34.0</w:t>
+            </w:r>
+          </w:p>
+        </w:tc>
+      </w:tr>
+      <w:tr>
+        <w:tc>
+          <w:tcPr>
+            <w:tcW w:type="dxa" w:w="3600"/>
           </w:tcPr>
           <w:p>
             <w:r>
@@ -958,7 +1719,7 @@
         </w:tc>
         <w:tc>
           <w:tcPr>
-            <w:tcW w:type="dxa" w:w="1224"/>
+            <w:tcW w:type="dxa" w:w="1152"/>
           </w:tcPr>
           <w:p>
             <w:r>
@@ -971,7 +1732,7 @@
         </w:tc>
         <w:tc>
           <w:tcPr>
-            <w:tcW w:type="dxa" w:w="1224"/>
+            <w:tcW w:type="dxa" w:w="1152"/>
           </w:tcPr>
           <w:p>
             <w:r>
@@ -984,7 +1745,7 @@
         </w:tc>
         <w:tc>
           <w:tcPr>
-            <w:tcW w:type="dxa" w:w="1224"/>
+            <w:tcW w:type="dxa" w:w="1152"/>
           </w:tcPr>
           <w:p>
             <w:r>
@@ -997,7 +1758,7 @@
         </w:tc>
         <w:tc>
           <w:tcPr>
-            <w:tcW w:type="dxa" w:w="1224"/>
+            <w:tcW w:type="dxa" w:w="1152"/>
           </w:tcPr>
           <w:p>
             <w:r>
@@ -1010,7 +1771,7 @@
         </w:tc>
         <w:tc>
           <w:tcPr>
-            <w:tcW w:type="dxa" w:w="1224"/>
+            <w:tcW w:type="dxa" w:w="1152"/>
           </w:tcPr>
           <w:p>
             <w:r>
@@ -1025,7 +1786,7 @@
       <w:tr>
         <w:tc>
           <w:tcPr>
-            <w:tcW w:type="dxa" w:w="3312"/>
+            <w:tcW w:type="dxa" w:w="3600"/>
           </w:tcPr>
           <w:p>
             <w:r>
@@ -1033,13 +1794,13 @@
                 <w:b/>
                 <w:sz w:val="19"/>
               </w:rPr>
-              <w:t>GLP-1 bridge + hair-loss (new)</w:t>
+              <w:t>Hair-loss + other new lines</w:t>
             </w:r>
           </w:p>
         </w:tc>
         <w:tc>
           <w:tcPr>
-            <w:tcW w:type="dxa" w:w="1224"/>
+            <w:tcW w:type="dxa" w:w="1152"/>
           </w:tcPr>
           <w:p>
             <w:r>
@@ -1052,7 +1813,7 @@
         </w:tc>
         <w:tc>
           <w:tcPr>
-            <w:tcW w:type="dxa" w:w="1224"/>
+            <w:tcW w:type="dxa" w:w="1152"/>
           </w:tcPr>
           <w:p>
             <w:r>
@@ -1065,7 +1826,7 @@
         </w:tc>
         <w:tc>
           <w:tcPr>
-            <w:tcW w:type="dxa" w:w="1224"/>
+            <w:tcW w:type="dxa" w:w="1152"/>
           </w:tcPr>
           <w:p>
             <w:r>
@@ -1078,7 +1839,7 @@
         </w:tc>
         <w:tc>
           <w:tcPr>
-            <w:tcW w:type="dxa" w:w="1224"/>
+            <w:tcW w:type="dxa" w:w="1152"/>
           </w:tcPr>
           <w:p>
             <w:r>
@@ -1091,7 +1852,7 @@
         </w:tc>
         <w:tc>
           <w:tcPr>
-            <w:tcW w:type="dxa" w:w="1224"/>
+            <w:tcW w:type="dxa" w:w="1152"/>
           </w:tcPr>
           <w:p>
             <w:r>
@@ -1106,7 +1867,7 @@
       <w:tr>
         <w:tc>
           <w:tcPr>
-            <w:tcW w:type="dxa" w:w="3312"/>
+            <w:tcW w:type="dxa" w:w="3600"/>
           </w:tcPr>
           <w:p>
             <w:r>
@@ -1120,7 +1881,7 @@
         </w:tc>
         <w:tc>
           <w:tcPr>
-            <w:tcW w:type="dxa" w:w="1224"/>
+            <w:tcW w:type="dxa" w:w="1152"/>
           </w:tcPr>
           <w:p>
             <w:r>
@@ -1128,13 +1889,13 @@
                 <w:b/>
                 <w:sz w:val="19"/>
               </w:rPr>
-              <w:t>15.0</w:t>
+              <w:t>17.2</w:t>
             </w:r>
           </w:p>
         </w:tc>
         <w:tc>
           <w:tcPr>
-            <w:tcW w:type="dxa" w:w="1224"/>
+            <w:tcW w:type="dxa" w:w="1152"/>
           </w:tcPr>
           <w:p>
             <w:r>
@@ -1142,13 +1903,13 @@
                 <w:b/>
                 <w:sz w:val="19"/>
               </w:rPr>
-              <w:t>18.3</w:t>
+              <w:t>35.0</w:t>
             </w:r>
           </w:p>
         </w:tc>
         <w:tc>
           <w:tcPr>
-            <w:tcW w:type="dxa" w:w="1224"/>
+            <w:tcW w:type="dxa" w:w="1152"/>
           </w:tcPr>
           <w:p>
             <w:r>
@@ -1156,13 +1917,13 @@
                 <w:b/>
                 <w:sz w:val="19"/>
               </w:rPr>
-              <w:t>24.3</w:t>
+              <w:t>49.3</w:t>
             </w:r>
           </w:p>
         </w:tc>
         <w:tc>
           <w:tcPr>
-            <w:tcW w:type="dxa" w:w="1224"/>
+            <w:tcW w:type="dxa" w:w="1152"/>
           </w:tcPr>
           <w:p>
             <w:r>
@@ -1170,13 +1931,13 @@
                 <w:b/>
                 <w:sz w:val="19"/>
               </w:rPr>
-              <w:t>32.0</w:t>
+              <w:t>62.0</w:t>
             </w:r>
           </w:p>
         </w:tc>
         <w:tc>
           <w:tcPr>
-            <w:tcW w:type="dxa" w:w="1224"/>
+            <w:tcW w:type="dxa" w:w="1152"/>
           </w:tcPr>
           <w:p>
             <w:r>
@@ -1184,7 +1945,7 @@
                 <w:b/>
                 <w:sz w:val="19"/>
               </w:rPr>
-              <w:t>41.1</w:t>
+              <w:t>75.1</w:t>
             </w:r>
           </w:p>
         </w:tc>
@@ -1192,7 +1953,7 @@
       <w:tr>
         <w:tc>
           <w:tcPr>
-            <w:tcW w:type="dxa" w:w="3312"/>
+            <w:tcW w:type="dxa" w:w="3600"/>
           </w:tcPr>
           <w:p>
             <w:r>
@@ -1206,7 +1967,7 @@
         </w:tc>
         <w:tc>
           <w:tcPr>
-            <w:tcW w:type="dxa" w:w="1224"/>
+            <w:tcW w:type="dxa" w:w="1152"/>
           </w:tcPr>
           <w:p>
             <w:r>
@@ -1214,13 +1975,13 @@
                 <w:b/>
                 <w:sz w:val="19"/>
               </w:rPr>
-              <w:t>1.3</w:t>
+              <w:t>1.8</w:t>
             </w:r>
           </w:p>
         </w:tc>
         <w:tc>
           <w:tcPr>
-            <w:tcW w:type="dxa" w:w="1224"/>
+            <w:tcW w:type="dxa" w:w="1152"/>
           </w:tcPr>
           <w:p>
             <w:r>
@@ -1228,13 +1989,13 @@
                 <w:b/>
                 <w:sz w:val="19"/>
               </w:rPr>
-              <w:t>2.9</w:t>
+              <w:t>6.2</w:t>
             </w:r>
           </w:p>
         </w:tc>
         <w:tc>
           <w:tcPr>
-            <w:tcW w:type="dxa" w:w="1224"/>
+            <w:tcW w:type="dxa" w:w="1152"/>
           </w:tcPr>
           <w:p>
             <w:r>
@@ -1242,13 +2003,13 @@
                 <w:b/>
                 <w:sz w:val="19"/>
               </w:rPr>
-              <w:t>6.1</w:t>
+              <w:t>11.1</w:t>
             </w:r>
           </w:p>
         </w:tc>
         <w:tc>
           <w:tcPr>
-            <w:tcW w:type="dxa" w:w="1224"/>
+            <w:tcW w:type="dxa" w:w="1152"/>
           </w:tcPr>
           <w:p>
             <w:r>
@@ -1256,13 +2017,13 @@
                 <w:b/>
                 <w:sz w:val="19"/>
               </w:rPr>
-              <w:t>10.2</w:t>
+              <w:t>16.2</w:t>
             </w:r>
           </w:p>
         </w:tc>
         <w:tc>
           <w:tcPr>
-            <w:tcW w:type="dxa" w:w="1224"/>
+            <w:tcW w:type="dxa" w:w="1152"/>
           </w:tcPr>
           <w:p>
             <w:r>
@@ -1270,7 +2031,7 @@
                 <w:b/>
                 <w:sz w:val="19"/>
               </w:rPr>
-              <w:t>14.9</w:t>
+              <w:t>21.7</w:t>
             </w:r>
           </w:p>
         </w:tc>
@@ -1292,7 +2053,7 @@
           <w:color w:val="555555"/>
           <w:sz w:val="18"/>
         </w:rPr>
-        <w:t>Assumptions: Eyesel base US$15M growing ~6%/yr at ~12% EBITDA margin [assumption]; GenApep vial model per the GenApep operating financial model (78.5% GM, EBITDA-positive 2027); GLP-1-bridge and hair-loss lines ramp from 2028 at ~30% contribution [illustrative placeholders].</w:t>
+        <w:t>Assumptions: Eyesel base US$15M growing ~6%/yr at ~12% EBITDA margin [assumption]; FVH GLP-1 per company proforma for 2026–2027, extrapolated 2028–2030 at roughly the 2027 enrollment pace with 10% attrition [to be confirmed by FVH], at ~20% EBITDA margin [assumption — proforma is gross reimbursement only]; GenApep vial model per the GenApep operating financial model (78.5% GM, EBITDA-positive 2027); hair-loss and other new lines ramp from 2028 at ~30% contribution [illustrative placeholders].</w:t>
       </w:r>
     </w:p>
     <w:p>
@@ -1300,7 +2061,7 @@
         <w:pStyle w:val="Heading2"/>
       </w:pPr>
       <w:r>
-        <w:t>6. Valuation management</w:t>
+        <w:t>7. Valuation management</w:t>
       </w:r>
     </w:p>
     <w:p>
@@ -1315,7 +2076,7 @@
         <w:t xml:space="preserve">Entry reference points — </w:t>
       </w:r>
       <w:r>
-        <w:t>GenApep JV previously framed at US$6M pre-money for a US$1M kickoff (device/consumables lens); Eyesel contributes ~US$15M revenue. Acquisition valuations for WBI and Eyesel [TBD] with independent support.</w:t>
+        <w:t>GenApep JV previously framed at US$6M pre-money for a US$1M kickoff (device/consumables lens); Eyesel contributes ~US$15M revenue; FVH contributes an operating GLP-1 program at a US$19M annualised MRR run-rate exiting 2027 (proforma). Acquisition valuations for WBI and Eyesel [TBD] with independent support.</w:t>
       </w:r>
     </w:p>
     <w:p>
@@ -1330,7 +2091,7 @@
         <w:t xml:space="preserve">Method for the listed company — </w:t>
       </w:r>
       <w:r>
-        <w:t>Sponsor-led comparables: specialty peptide / medical-aesthetics / CDMO peers (indicative placeholder ranges: 3–6× revenue or 10–15× EBITDA — to be validated by the IPO sponsor), cross-checked with DCF on the consolidated plan.</w:t>
+        <w:t>Sponsor-led comparables: specialty peptide / medical-aesthetics / CDMO peers for the Korean business, and recurring-revenue digital-health / care-management peers for the FVH GLP-1 platform (indicative placeholder ranges: 3–6× revenue or 10–15× EBITDA — to be validated by the IPO sponsor), cross-checked with DCF on the consolidated plan.</w:t>
       </w:r>
     </w:p>
     <w:p>
@@ -1345,7 +2106,7 @@
         <w:t xml:space="preserve">Value-creation levers — </w:t>
       </w:r>
       <w:r>
-        <w:t>Consolidated growth (US$15M base + GenApep ramp + synergy lines), gross-margin expansion toward the ~78.5% consumable model, GLP-1-bridge and hair-loss optionality, and liquidity/uplisting premium as reporting history builds.</w:t>
+        <w:t>Consolidated growth (US$15M Eyesel base + FVH GLP-1 ramp + GenApep ramp + hair-loss optionality), gross-margin expansion toward the ~78.5% consumable model, recurring-revenue mix (care-management MRR + consumable reorders), and liquidity/uplisting premium as reporting history builds.</w:t>
       </w:r>
     </w:p>
     <w:p>
@@ -1368,7 +2129,7 @@
         <w:pStyle w:val="Heading2"/>
       </w:pPr>
       <w:r>
-        <w:t>7. Conditions precedent &amp; key risks</w:t>
+        <w:t>8. Conditions precedent &amp; key risks</w:t>
       </w:r>
     </w:p>
     <w:p>
@@ -1386,7 +2147,7 @@
         <w:spacing w:after="60"/>
       </w:pPr>
       <w:r>
-        <w:t>Satisfactory mutual due diligence (corporate, financial, IP, regulatory, tax) on FVH, WBI and Eyesel.</w:t>
+        <w:t>Satisfactory mutual due diligence (corporate, financial, IP, regulatory, tax) on FVH, WBI and Eyesel — including confirmation of FVH's EDGAR filing history and the assumptions of the GLP-1 proforma (reimbursement rates, enrollment, attrition).</w:t>
       </w:r>
     </w:p>
     <w:p>
@@ -1422,6 +2183,15 @@
         <w:spacing w:after="60"/>
       </w:pPr>
       <w:r>
+        <w:t>U.S. healthcare-regulatory compliance of the GLP-1 program (billing/coding, telehealth and RPM/PCM rules, state scope-of-practice).</w:t>
+      </w:r>
+    </w:p>
+    <w:p>
+      <w:pPr>
+        <w:pStyle w:val="ListNumber"/>
+        <w:spacing w:after="60"/>
+      </w:pPr>
+      <w:r>
         <w:t>Board and shareholder approvals of each party, including the current shareholders of WBI.</w:t>
       </w:r>
     </w:p>
@@ -1448,7 +2218,7 @@
         <w:pStyle w:val="Heading2"/>
       </w:pPr>
       <w:r>
-        <w:t>8. Indicative timeline</w:t>
+        <w:t>9. Indicative timeline</w:t>
       </w:r>
     </w:p>
     <w:tbl>
@@ -1516,7 +2286,7 @@
               <w:rPr>
                 <w:sz w:val="19"/>
               </w:rPr>
-              <w:t>Three-party discussion on this MOU; due diligence; definitive agreements; PCAOB audit preparation; FVH SEC status maintenance.</w:t>
+              <w:t>Three-party discussion on this MOU; due diligence; definitive agreements; PCAOB audit preparation; FVH SEC status maintenance. FVH GLP-1 program enrolling from Jul-2026 (2,500 patients by Dec-2026).</w:t>
             </w:r>
           </w:p>
         </w:tc>
@@ -1632,7 +2402,7 @@
               <w:rPr>
                 <w:sz w:val="19"/>
               </w:rPr>
-              <w:t>First consolidated year: ~US$18M+ revenue (illustrative); GenApep production ramp from Feb 2027; GLP-1-bridge and hair-loss programs formalised.</w:t>
+              <w:t>First consolidated year: ~US$35M revenue (illustrative); GenApep production ramp from Feb-2027; FVH GLP-1 program scaling to 10,000 patients; GLP-1-bridge and hair-loss synergy programs formalised.</w:t>
             </w:r>
           </w:p>
         </w:tc>
@@ -1677,7 +2447,7 @@
         <w:pStyle w:val="Heading2"/>
       </w:pPr>
       <w:r>
-        <w:t>9. Non-binding nature &amp; confidentiality</w:t>
+        <w:t>10. Non-binding nature &amp; confidentiality</w:t>
       </w:r>
     </w:p>
     <w:p>
@@ -1698,7 +2468,7 @@
         <w:pStyle w:val="Heading2"/>
       </w:pPr>
       <w:r>
-        <w:t>10. Signatures (draft)</w:t>
+        <w:t>11. Signatures (draft)</w:t>
       </w:r>
     </w:p>
     <w:tbl>
@@ -2437,10 +3207,11 @@
       <w:outlineLvl w:val="2"/>
     </w:pPr>
     <w:rPr>
-      <w:rFonts w:asciiTheme="majorHAnsi" w:eastAsiaTheme="majorEastAsia" w:hAnsiTheme="majorHAnsi" w:cstheme="majorBidi"/>
+      <w:rFonts w:asciiTheme="majorHAnsi" w:eastAsiaTheme="majorEastAsia" w:hAnsiTheme="majorHAnsi" w:cstheme="majorBidi" w:ascii="Calibri" w:hAnsi="Calibri"/>
       <w:b/>
       <w:bCs/>
-      <w:color w:val="4F81BD" w:themeColor="accent1"/>
+      <w:color w:val="1B3355"/>
+      <w:sz w:val="23"/>
     </w:rPr>
   </w:style>
   <w:style w:type="paragraph" w:styleId="Heading4">

</xml_diff>